<commit_message>
Update June forum posts and analysis docs
</commit_message>
<xml_diff>
--- a/weekly_docs/科学技术打头阵_发言整理_2026-W27.docx
+++ b/weekly_docs/科学技术打头阵_发言整理_2026-W27.docx
@@ -16,7 +16,7 @@
         <w:jc w:val="center"/>
       </w:pPr>
       <w:r>
-        <w:t>2026-06-29 至 2026-07-05；共 69 条</w:t>
+        <w:t>2026-06-29 至 2026-07-05；共 94 条</w:t>
       </w:r>
     </w:p>
     <w:tbl>
@@ -5280,6 +5280,2288 @@
                 <w:sz w:val="20"/>
               </w:rPr>
               <w:t>操作策略没有最对的，只有最适合自己的。起码目前我跟楼半年找到了适合自己的操作方式，唯有感恩。</w:t>
+            </w:r>
+          </w:p>
+        </w:tc>
+      </w:tr>
+    </w:tbl>
+    <w:p>
+      <w:pPr>
+        <w:spacing w:after="40"/>
+      </w:pPr>
+    </w:p>
+    <w:tbl>
+      <w:tblPr>
+        <w:tblStyle w:val="TableGrid"/>
+        <w:tblW w:type="auto" w:w="0"/>
+        <w:tblLook w:firstColumn="1" w:firstRow="1" w:lastColumn="0" w:lastRow="0" w:noHBand="0" w:noVBand="1" w:val="04A0"/>
+      </w:tblPr>
+      <w:tblGrid>
+        <w:gridCol w:w="10080"/>
+      </w:tblGrid>
+      <w:tr>
+        <w:tc>
+          <w:tcPr>
+            <w:tcW w:type="dxa" w:w="10080"/>
+            <w:shd w:fill="EAF3EA"/>
+          </w:tcPr>
+          <w:p>
+            <w:pPr>
+              <w:spacing w:after="0"/>
+            </w:pPr>
+            <w:r>
+              <w:rPr>
+                <w:b/>
+                <w:color w:val="166534"/>
+                <w:sz w:val="23"/>
+              </w:rPr>
+              <w:t>2026-06-29 16:25  |  3475楼  |  狼大  |  UID 150058</w:t>
+            </w:r>
+          </w:p>
+        </w:tc>
+      </w:tr>
+      <w:tr>
+        <w:tc>
+          <w:tcPr>
+            <w:tcW w:type="dxa" w:w="10080"/>
+          </w:tcPr>
+          <w:p>
+            <w:pPr>
+              <w:spacing w:line="276" w:lineRule="auto" w:after="100"/>
+            </w:pPr>
+            <w:r>
+              <w:rPr>
+                <w:color w:val="111827"/>
+                <w:sz w:val="24"/>
+              </w:rPr>
+              <w:t>Reply Post by alleriawr9二号机 (2026-06-29 16:20):</w:t>
+            </w:r>
+          </w:p>
+          <w:p>
+            <w:pPr>
+              <w:spacing w:line="276" w:lineRule="auto" w:after="100"/>
+            </w:pPr>
+            <w:r>
+              <w:rPr>
+                <w:color w:val="111827"/>
+                <w:sz w:val="24"/>
+              </w:rPr>
+              <w:t>不是，你们真看不懂狼大在说什么吗，见好就收就是指，对下半年铁盒依然保持两倍涨幅没信心了，这个判断之后也就不要再提了。</w:t>
+            </w:r>
+            <w:r>
+              <w:br/>
+            </w:r>
+            <w:r>
+              <w:rPr>
+                <w:color w:val="111827"/>
+                <w:sz w:val="24"/>
+              </w:rPr>
+              <w:t>但是半导体是不是不能玩了呢？铁盒包括设备和材料，我贴了一些之前的回复，结合起来看就很明显了，设备上半年跑通，下半年材料还可以做。</w:t>
+            </w:r>
+            <w:r>
+              <w:br/>
+            </w:r>
+            <w:r>
+              <w:rPr>
+                <w:color w:val="111827"/>
+                <w:sz w:val="24"/>
+              </w:rPr>
+              <w:t>嗯 等中报完 科技调仓的时候 扩产带来的材料消耗周期不会变的</w:t>
+            </w:r>
+            <w:r>
+              <w:br/>
+            </w:r>
+            <w:r>
+              <w:rPr>
+                <w:color w:val="111827"/>
+                <w:sz w:val="24"/>
+              </w:rPr>
+              <w:t>特别是我们现在基本纯靠国产替代</w:t>
+            </w:r>
+            <w:r>
+              <w:br/>
+            </w:r>
+            <w:r>
+              <w:rPr>
+                <w:color w:val="111827"/>
+                <w:sz w:val="24"/>
+              </w:rPr>
+              <w:t>这种暂时明显还是落后于世界最顶级芯片的，那又要尽量接近于世界最顶级算力的情况下</w:t>
+            </w:r>
+            <w:r>
+              <w:br/>
+            </w:r>
+            <w:r>
+              <w:rPr>
+                <w:color w:val="111827"/>
+                <w:sz w:val="24"/>
+              </w:rPr>
+              <w:t>只能是加速 加倍消耗材料</w:t>
+            </w:r>
+            <w:r>
+              <w:br/>
+            </w:r>
+            <w:r>
+              <w:rPr>
+                <w:color w:val="111827"/>
+                <w:sz w:val="24"/>
+              </w:rPr>
+              <w:t>用量堆出质</w:t>
+            </w:r>
+            <w:r>
+              <w:br/>
+            </w:r>
+            <w:r>
+              <w:rPr>
+                <w:color w:val="111827"/>
+                <w:sz w:val="24"/>
+              </w:rPr>
+              <w:t>这也是符合涛定律的核心理念，不是弯道超车，是被强封锁后的无奈突围。</w:t>
+            </w:r>
+          </w:p>
+          <w:p>
+            <w:pPr>
+              <w:spacing w:line="276" w:lineRule="auto" w:after="100"/>
+            </w:pPr>
+            <w:r>
+              <w:rPr>
+                <w:color w:val="111827"/>
+                <w:sz w:val="24"/>
+              </w:rPr>
+              <w:t>这也是为什么我之前说 上半年设备 下半年材料的核心底层逻辑</w:t>
+            </w:r>
+          </w:p>
+          <w:p>
+            <w:pPr>
+              <w:spacing w:line="276" w:lineRule="auto" w:after="100"/>
+            </w:pPr>
+            <w:r>
+              <w:rPr>
+                <w:color w:val="111827"/>
+                <w:sz w:val="24"/>
+              </w:rPr>
+              <w:t>不过这里相对高位，高位看量价，低位才看逻辑。</w:t>
+            </w:r>
+          </w:p>
+        </w:tc>
+      </w:tr>
+    </w:tbl>
+    <w:p>
+      <w:pPr>
+        <w:spacing w:after="40"/>
+      </w:pPr>
+    </w:p>
+    <w:tbl>
+      <w:tblPr>
+        <w:tblStyle w:val="TableGrid"/>
+        <w:tblW w:type="auto" w:w="0"/>
+        <w:tblLook w:firstColumn="1" w:firstRow="1" w:lastColumn="0" w:lastRow="0" w:noHBand="0" w:noVBand="1" w:val="04A0"/>
+      </w:tblPr>
+      <w:tblGrid>
+        <w:gridCol w:w="10080"/>
+      </w:tblGrid>
+      <w:tr>
+        <w:tc>
+          <w:tcPr>
+            <w:tcW w:type="dxa" w:w="10080"/>
+            <w:shd w:fill="F3F4F6"/>
+          </w:tcPr>
+          <w:p>
+            <w:pPr>
+              <w:spacing w:after="0"/>
+            </w:pPr>
+            <w:r>
+              <w:rPr>
+                <w:b/>
+                <w:color w:val="374151"/>
+                <w:sz w:val="19"/>
+              </w:rPr>
+              <w:t>2026-06-29 16:28  |  1522楼  |  包子music  |  UID 42162697</w:t>
+            </w:r>
+          </w:p>
+        </w:tc>
+      </w:tr>
+      <w:tr>
+        <w:tc>
+          <w:tcPr>
+            <w:tcW w:type="dxa" w:w="10080"/>
+          </w:tcPr>
+          <w:p>
+            <w:pPr>
+              <w:spacing w:line="276" w:lineRule="auto" w:after="100"/>
+            </w:pPr>
+            <w:r>
+              <w:rPr>
+                <w:sz w:val="20"/>
+              </w:rPr>
+              <w:t>Reply to Reply Post by -我爱切尔西- (2026-06-29 16:24)我现在基本就看三次盘：10:00一次，午睡醒了一次，尾盘一次。就是看一眼挂个单，没到位就摆，到位就移动止盈止损。我除了有时间盯盘会按15min*3战法操作，否则都是日k级/周k级的指标来挂单。沪电75启动前我甚至是按月k倍仓的。</w:t>
+            </w:r>
+          </w:p>
+          <w:p>
+            <w:pPr>
+              <w:spacing w:line="276" w:lineRule="auto" w:after="100"/>
+            </w:pPr>
+            <w:r>
+              <w:rPr>
+                <w:sz w:val="20"/>
+              </w:rPr>
+              <w:t>15min不适合要干活的人，</w:t>
+            </w:r>
+            <w:r>
+              <w:br/>
+            </w:r>
+            <w:r>
+              <w:rPr>
+                <w:sz w:val="20"/>
+              </w:rPr>
+              <w:t>高强度盯盘做多铁盒科技，</w:t>
+            </w:r>
+            <w:r>
+              <w:br/>
+            </w:r>
+            <w:r>
+              <w:rPr>
+                <w:sz w:val="20"/>
+              </w:rPr>
+              <w:t>不如高强度做多饭盒科研。</w:t>
+            </w:r>
+          </w:p>
+        </w:tc>
+      </w:tr>
+    </w:tbl>
+    <w:p>
+      <w:pPr>
+        <w:spacing w:after="40"/>
+      </w:pPr>
+    </w:p>
+    <w:tbl>
+      <w:tblPr>
+        <w:tblStyle w:val="TableGrid"/>
+        <w:tblW w:type="auto" w:w="0"/>
+        <w:tblLook w:firstColumn="1" w:firstRow="1" w:lastColumn="0" w:lastRow="0" w:noHBand="0" w:noVBand="1" w:val="04A0"/>
+      </w:tblPr>
+      <w:tblGrid>
+        <w:gridCol w:w="10080"/>
+      </w:tblGrid>
+      <w:tr>
+        <w:tc>
+          <w:tcPr>
+            <w:tcW w:type="dxa" w:w="10080"/>
+            <w:shd w:fill="F3F4F6"/>
+          </w:tcPr>
+          <w:p>
+            <w:pPr>
+              <w:spacing w:after="0"/>
+            </w:pPr>
+            <w:r>
+              <w:rPr>
+                <w:b/>
+                <w:color w:val="374151"/>
+                <w:sz w:val="19"/>
+              </w:rPr>
+              <w:t>2026-06-29 16:54  |  1554楼  |  zippo578  |  UID 65329649</w:t>
+            </w:r>
+          </w:p>
+        </w:tc>
+      </w:tr>
+      <w:tr>
+        <w:tc>
+          <w:tcPr>
+            <w:tcW w:type="dxa" w:w="10080"/>
+          </w:tcPr>
+          <w:p>
+            <w:pPr>
+              <w:spacing w:line="276" w:lineRule="auto" w:after="100"/>
+            </w:pPr>
+            <w:r>
+              <w:rPr>
+                <w:sz w:val="20"/>
+              </w:rPr>
+              <w:t>Reply to Reply Post by 织梦难知醒 (2026-06-29 15:09)</w:t>
+            </w:r>
+            <w:r>
+              <w:br/>
+            </w:r>
+            <w:r>
+              <w:rPr>
+                <w:sz w:val="20"/>
+              </w:rPr>
+              <w:t>不是技术底</w:t>
+            </w:r>
+            <w:r>
+              <w:br/>
+            </w:r>
+            <w:r>
+              <w:rPr>
+                <w:sz w:val="20"/>
+              </w:rPr>
+              <w:t>上午第二个小时开始缩量</w:t>
+            </w:r>
+            <w:r>
+              <w:br/>
+            </w:r>
+            <w:r>
+              <w:rPr>
+                <w:sz w:val="20"/>
+              </w:rPr>
+              <w:t>然后下午第一个十五分钟缩量下跌</w:t>
+            </w:r>
+            <w:r>
+              <w:br/>
+            </w:r>
+            <w:r>
+              <w:rPr>
+                <w:sz w:val="20"/>
+              </w:rPr>
+              <w:t>更多的是博吧</w:t>
+            </w:r>
+            <w:r>
+              <w:br/>
+            </w:r>
+            <w:r>
+              <w:rPr>
+                <w:sz w:val="20"/>
+              </w:rPr>
+              <w:t>那位置如果缩转放，那就是灌肠阴了</w:t>
+            </w:r>
+          </w:p>
+        </w:tc>
+      </w:tr>
+    </w:tbl>
+    <w:p>
+      <w:pPr>
+        <w:spacing w:after="40"/>
+      </w:pPr>
+    </w:p>
+    <w:tbl>
+      <w:tblPr>
+        <w:tblStyle w:val="TableGrid"/>
+        <w:tblW w:type="auto" w:w="0"/>
+        <w:tblLook w:firstColumn="1" w:firstRow="1" w:lastColumn="0" w:lastRow="0" w:noHBand="0" w:noVBand="1" w:val="04A0"/>
+      </w:tblPr>
+      <w:tblGrid>
+        <w:gridCol w:w="10080"/>
+      </w:tblGrid>
+      <w:tr>
+        <w:tc>
+          <w:tcPr>
+            <w:tcW w:type="dxa" w:w="10080"/>
+            <w:shd w:fill="F3F4F6"/>
+          </w:tcPr>
+          <w:p>
+            <w:pPr>
+              <w:spacing w:after="0"/>
+            </w:pPr>
+            <w:r>
+              <w:rPr>
+                <w:b/>
+                <w:color w:val="374151"/>
+                <w:sz w:val="19"/>
+              </w:rPr>
+              <w:t>2026-06-29 17:02  |  1523楼  |  包子music  |  UID 42162697</w:t>
+            </w:r>
+          </w:p>
+        </w:tc>
+      </w:tr>
+      <w:tr>
+        <w:tc>
+          <w:tcPr>
+            <w:tcW w:type="dxa" w:w="10080"/>
+          </w:tcPr>
+          <w:p>
+            <w:pPr>
+              <w:spacing w:line="276" w:lineRule="auto" w:after="100"/>
+            </w:pPr>
+            <w:r>
+              <w:rPr>
+                <w:sz w:val="20"/>
+              </w:rPr>
+              <w:t>Reply to Reply Post by frank628 (2026-06-29 16:44)长线逻辑靠咱自己想，大涨和大跌就会有人给你找逻辑了。</w:t>
+            </w:r>
+          </w:p>
+          <w:p>
+            <w:pPr>
+              <w:spacing w:line="276" w:lineRule="auto" w:after="100"/>
+            </w:pPr>
+            <w:r>
+              <w:rPr>
+                <w:sz w:val="20"/>
+              </w:rPr>
+              <w:t>大半年前点出铁盒和宝贝王国的长线仓的时候，也没见同步分享逻辑，验证的那天已经没有溢价了，涨起来谁都看得懂逻辑。这个帖子16w楼，任何一个漏的标都起码有100楼讨论过相关的逻辑。</w:t>
+            </w:r>
+          </w:p>
+          <w:p>
+            <w:pPr>
+              <w:spacing w:line="276" w:lineRule="auto" w:after="100"/>
+            </w:pPr>
+            <w:r>
+              <w:rPr>
+                <w:sz w:val="20"/>
+              </w:rPr>
+              <w:t>假设这16w回帖里面有10%的楼层是不带情绪的认真讨论，且每层你能看进去8个字的话，那也是12w字。做对主线控制回撤，低买高卖才能赚钱，自立自强科学技术。这些都是8字焚决，没那么难记。</w:t>
+            </w:r>
+          </w:p>
+          <w:p>
+            <w:pPr>
+              <w:spacing w:line="276" w:lineRule="auto" w:after="100"/>
+            </w:pPr>
+            <w:r>
+              <w:rPr>
+                <w:sz w:val="20"/>
+              </w:rPr>
+              <w:t>余华的《活着》也是12w字，没有狼楼的时候我读它思考人生，进了狼楼我跟楼思考人生。而互联网时代人们丢掉了读书的沉稳，连爬楼都日益浮躁了。</w:t>
+            </w:r>
+            <w:r>
+              <w:br/>
+            </w:r>
+            <w:r>
+              <w:rPr>
+                <w:sz w:val="20"/>
+              </w:rPr>
+              <w:t>明明一切都白纸黑字躺在那里，亦如在书中娓娓讲述人生的福贵。而我知道这楼里的12w字是能让我在股市里《活着》的，仅此而已。</w:t>
+            </w:r>
+          </w:p>
+        </w:tc>
+      </w:tr>
+    </w:tbl>
+    <w:p>
+      <w:pPr>
+        <w:spacing w:after="40"/>
+      </w:pPr>
+    </w:p>
+    <w:tbl>
+      <w:tblPr>
+        <w:tblStyle w:val="TableGrid"/>
+        <w:tblW w:type="auto" w:w="0"/>
+        <w:tblLook w:firstColumn="1" w:firstRow="1" w:lastColumn="0" w:lastRow="0" w:noHBand="0" w:noVBand="1" w:val="04A0"/>
+      </w:tblPr>
+      <w:tblGrid>
+        <w:gridCol w:w="10080"/>
+      </w:tblGrid>
+      <w:tr>
+        <w:tc>
+          <w:tcPr>
+            <w:tcW w:type="dxa" w:w="10080"/>
+            <w:shd w:fill="F3F4F6"/>
+          </w:tcPr>
+          <w:p>
+            <w:pPr>
+              <w:spacing w:after="0"/>
+            </w:pPr>
+            <w:r>
+              <w:rPr>
+                <w:b/>
+                <w:color w:val="374151"/>
+                <w:sz w:val="19"/>
+              </w:rPr>
+              <w:t>2026-06-29 17:23  |  1524楼  |  包子music  |  UID 42162697</w:t>
+            </w:r>
+          </w:p>
+        </w:tc>
+      </w:tr>
+      <w:tr>
+        <w:tc>
+          <w:tcPr>
+            <w:tcW w:type="dxa" w:w="10080"/>
+          </w:tcPr>
+          <w:p>
+            <w:pPr>
+              <w:spacing w:line="276" w:lineRule="auto" w:after="100"/>
+            </w:pPr>
+            <w:r>
+              <w:rPr>
+                <w:sz w:val="20"/>
+              </w:rPr>
+              <w:t>Reply to Reply Post by hua8493 (2026-06-29 17:12)小巧思没亏啊，因为那是我应得的学费；跑不赢铁盒那肯定是我的问题，6月到现在赚的比5月还多[s:ac:吻]</w:t>
+            </w:r>
+            <w:r>
+              <w:br/>
+            </w:r>
+            <w:r>
+              <w:rPr>
+                <w:sz w:val="20"/>
+              </w:rPr>
+              <w:t>在楼里学完还得建议好兄弟操作，跟他说神秘锁妖塔200以上全是套牢盘，逻辑和量价支撑不起同等高度的双头；且泥潭神秘人曾经说过任何指数和股价超过正百都可能有20~30的惯性。所以200喊他put，200~220都是胜率不低的好short位。</w:t>
+            </w:r>
+          </w:p>
+          <w:p>
+            <w:pPr>
+              <w:spacing w:line="276" w:lineRule="auto" w:after="100"/>
+            </w:pPr>
+            <w:r>
+              <w:rPr>
+                <w:sz w:val="20"/>
+              </w:rPr>
+              <w:t>结果大哥就听了一半，回落到200又惦记倍仓抄底了[s:a2:自戳双目]现在天天问我哪学的技术和基本面逻辑。[del]虽然我也在打野标里亏钱，但不妨碍靠hxd请客吃饭回血[/del]</w:t>
+            </w:r>
+          </w:p>
+        </w:tc>
+      </w:tr>
+    </w:tbl>
+    <w:p>
+      <w:pPr>
+        <w:spacing w:after="40"/>
+      </w:pPr>
+    </w:p>
+    <w:tbl>
+      <w:tblPr>
+        <w:tblStyle w:val="TableGrid"/>
+        <w:tblW w:type="auto" w:w="0"/>
+        <w:tblLook w:firstColumn="1" w:firstRow="1" w:lastColumn="0" w:lastRow="0" w:noHBand="0" w:noVBand="1" w:val="04A0"/>
+      </w:tblPr>
+      <w:tblGrid>
+        <w:gridCol w:w="10080"/>
+      </w:tblGrid>
+      <w:tr>
+        <w:tc>
+          <w:tcPr>
+            <w:tcW w:type="dxa" w:w="10080"/>
+            <w:shd w:fill="F3F4F6"/>
+          </w:tcPr>
+          <w:p>
+            <w:pPr>
+              <w:spacing w:after="0"/>
+            </w:pPr>
+            <w:r>
+              <w:rPr>
+                <w:b/>
+                <w:color w:val="374151"/>
+                <w:sz w:val="19"/>
+              </w:rPr>
+              <w:t>2026-06-29 18:01  |  2983楼  |  Rzzz二号机  |  UID 67143809</w:t>
+            </w:r>
+          </w:p>
+        </w:tc>
+      </w:tr>
+      <w:tr>
+        <w:tc>
+          <w:tcPr>
+            <w:tcW w:type="dxa" w:w="10080"/>
+          </w:tcPr>
+          <w:p>
+            <w:pPr>
+              <w:spacing w:line="276" w:lineRule="auto" w:after="100"/>
+            </w:pPr>
+            <w:r>
+              <w:rPr>
+                <w:sz w:val="20"/>
+              </w:rPr>
+              <w:t>Reply Post by 你看看你？ (2026-06-29 17:54):</w:t>
+            </w:r>
+          </w:p>
+          <w:p>
+            <w:pPr>
+              <w:spacing w:line="276" w:lineRule="auto" w:after="100"/>
+            </w:pPr>
+            <w:r>
+              <w:rPr>
+                <w:sz w:val="20"/>
+              </w:rPr>
+              <w:t>sora 酱在外面 boss 直聘了，还抛砖引玉了，至少其中一个标的明确啦[s:ac:哭笑]</w:t>
+            </w:r>
+          </w:p>
+          <w:p>
+            <w:pPr>
+              <w:spacing w:line="276" w:lineRule="auto" w:after="100"/>
+            </w:pPr>
+            <w:r>
+              <w:rPr>
+                <w:sz w:val="20"/>
+              </w:rPr>
+              <w:t>[s:ac:哭笑]多氟多这个车 我觉得也是有点颠</w:t>
+            </w:r>
+          </w:p>
+        </w:tc>
+      </w:tr>
+    </w:tbl>
+    <w:p>
+      <w:pPr>
+        <w:spacing w:after="40"/>
+      </w:pPr>
+    </w:p>
+    <w:tbl>
+      <w:tblPr>
+        <w:tblStyle w:val="TableGrid"/>
+        <w:tblW w:type="auto" w:w="0"/>
+        <w:tblLook w:firstColumn="1" w:firstRow="1" w:lastColumn="0" w:lastRow="0" w:noHBand="0" w:noVBand="1" w:val="04A0"/>
+      </w:tblPr>
+      <w:tblGrid>
+        <w:gridCol w:w="10080"/>
+      </w:tblGrid>
+      <w:tr>
+        <w:tc>
+          <w:tcPr>
+            <w:tcW w:type="dxa" w:w="10080"/>
+            <w:shd w:fill="F3F4F6"/>
+          </w:tcPr>
+          <w:p>
+            <w:pPr>
+              <w:spacing w:after="0"/>
+            </w:pPr>
+            <w:r>
+              <w:rPr>
+                <w:b/>
+                <w:color w:val="374151"/>
+                <w:sz w:val="19"/>
+              </w:rPr>
+              <w:t>2026-06-29 20:36  |  1512楼  |  xbox  |  UID 331181</w:t>
+            </w:r>
+          </w:p>
+        </w:tc>
+      </w:tr>
+      <w:tr>
+        <w:tc>
+          <w:tcPr>
+            <w:tcW w:type="dxa" w:w="10080"/>
+          </w:tcPr>
+          <w:p>
+            <w:pPr>
+              <w:spacing w:line="276" w:lineRule="auto" w:after="100"/>
+            </w:pPr>
+            <w:r>
+              <w:rPr>
+                <w:sz w:val="20"/>
+              </w:rPr>
+              <w:t>高潮扩散四阶段演变追踪：</w:t>
+            </w:r>
+            <w:r>
+              <w:br/>
+            </w:r>
+            <w:r>
+              <w:rPr>
+                <w:sz w:val="20"/>
+              </w:rPr>
+              <w:t>[table]</w:t>
+            </w:r>
+            <w:r>
+              <w:br/>
+            </w:r>
+            <w:r>
+              <w:rPr>
+                <w:sz w:val="20"/>
+              </w:rPr>
+              <w:t>[tr]</w:t>
+            </w:r>
+            <w:r>
+              <w:br/>
+            </w:r>
+            <w:r>
+              <w:rPr>
+                <w:sz w:val="20"/>
+              </w:rPr>
+              <w:t>[td]日期[/td][td]机构[/td][td]外资[/td][td]游资[/td][td]阶段[/td][td]关键信号[/td]</w:t>
+            </w:r>
+            <w:r>
+              <w:br/>
+            </w:r>
+            <w:r>
+              <w:rPr>
+                <w:sz w:val="20"/>
+              </w:rPr>
+              <w:t>[/tr]</w:t>
+            </w:r>
+            <w:r>
+              <w:br/>
+            </w:r>
+            <w:r>
+              <w:rPr>
+                <w:sz w:val="20"/>
+              </w:rPr>
+              <w:t>[tr]</w:t>
+            </w:r>
+            <w:r>
+              <w:br/>
+            </w:r>
+            <w:r>
+              <w:rPr>
+                <w:sz w:val="20"/>
+              </w:rPr>
+              <w:t>[td]6/22[/td]</w:t>
+            </w:r>
+            <w:r>
+              <w:br/>
+            </w:r>
+            <w:r>
+              <w:rPr>
+                <w:sz w:val="20"/>
+              </w:rPr>
+              <w:t>[td]-31.64亿[/td]</w:t>
+            </w:r>
+            <w:r>
+              <w:br/>
+            </w:r>
+            <w:r>
+              <w:rPr>
+                <w:sz w:val="20"/>
+              </w:rPr>
+              <w:t>[td]—[/td]</w:t>
+            </w:r>
+            <w:r>
+              <w:br/>
+            </w:r>
+            <w:r>
+              <w:rPr>
+                <w:sz w:val="20"/>
+              </w:rPr>
+              <w:t>[td]+20.38亿[/td]</w:t>
+            </w:r>
+            <w:r>
+              <w:br/>
+            </w:r>
+            <w:r>
+              <w:rPr>
+                <w:sz w:val="20"/>
+              </w:rPr>
+              <w:t>[td]早期信号[/td]</w:t>
+            </w:r>
+            <w:r>
+              <w:br/>
+            </w:r>
+            <w:r>
+              <w:rPr>
+                <w:sz w:val="20"/>
+              </w:rPr>
+              <w:t>[td]机构卖+游资攻[/td][/tr]</w:t>
+            </w:r>
+            <w:r>
+              <w:br/>
+            </w:r>
+            <w:r>
+              <w:rPr>
+                <w:sz w:val="20"/>
+              </w:rPr>
+              <w:t>[tr]</w:t>
+            </w:r>
+            <w:r>
+              <w:br/>
+            </w:r>
+            <w:r>
+              <w:rPr>
+                <w:sz w:val="20"/>
+              </w:rPr>
+              <w:t>[td]6/24[/td]</w:t>
+            </w:r>
+            <w:r>
+              <w:br/>
+            </w:r>
+            <w:r>
+              <w:rPr>
+                <w:sz w:val="20"/>
+              </w:rPr>
+              <w:t>[td]+99.93亿[/td]</w:t>
+            </w:r>
+            <w:r>
+              <w:br/>
+            </w:r>
+            <w:r>
+              <w:rPr>
+                <w:sz w:val="20"/>
+              </w:rPr>
+              <w:t>[td]+36.01亿[/td]</w:t>
+            </w:r>
+            <w:r>
+              <w:br/>
+            </w:r>
+            <w:r>
+              <w:rPr>
+                <w:sz w:val="20"/>
+              </w:rPr>
+              <w:t>[td]-1.32亿[/td]</w:t>
+            </w:r>
+            <w:r>
+              <w:br/>
+            </w:r>
+            <w:r>
+              <w:rPr>
+                <w:sz w:val="20"/>
+              </w:rPr>
+              <w:t>[td]机构派发[/td]</w:t>
+            </w:r>
+            <w:r>
+              <w:br/>
+            </w:r>
+            <w:r>
+              <w:rPr>
+                <w:sz w:val="20"/>
+              </w:rPr>
+              <w:t>[td]机构独买+游资翻卖[/td][/tr]</w:t>
+            </w:r>
+            <w:r>
+              <w:br/>
+            </w:r>
+            <w:r>
+              <w:rPr>
+                <w:sz w:val="20"/>
+              </w:rPr>
+              <w:t>[tr]</w:t>
+            </w:r>
+            <w:r>
+              <w:br/>
+            </w:r>
+            <w:r>
+              <w:rPr>
+                <w:sz w:val="20"/>
+              </w:rPr>
+              <w:t>[td]6/25[/td]</w:t>
+            </w:r>
+            <w:r>
+              <w:br/>
+            </w:r>
+            <w:r>
+              <w:rPr>
+                <w:sz w:val="20"/>
+              </w:rPr>
+              <w:t>[td]+54.81亿[/td]</w:t>
+            </w:r>
+            <w:r>
+              <w:br/>
+            </w:r>
+            <w:r>
+              <w:rPr>
+                <w:sz w:val="20"/>
+              </w:rPr>
+              <w:t>[td]+61.10亿[/td]</w:t>
+            </w:r>
+            <w:r>
+              <w:br/>
+            </w:r>
+            <w:r>
+              <w:rPr>
+                <w:sz w:val="20"/>
+              </w:rPr>
+              <w:t>[td]+40.11亿[/td]</w:t>
+            </w:r>
+            <w:r>
+              <w:br/>
+            </w:r>
+            <w:r>
+              <w:rPr>
+                <w:sz w:val="20"/>
+              </w:rPr>
+              <w:t>[td]→过渡[/td]</w:t>
+            </w:r>
+            <w:r>
+              <w:br/>
+            </w:r>
+            <w:r>
+              <w:rPr>
+                <w:sz w:val="20"/>
+              </w:rPr>
+              <w:t>[td]机构减半+外资游资主攻[/td][/tr]</w:t>
+            </w:r>
+            <w:r>
+              <w:br/>
+            </w:r>
+            <w:r>
+              <w:rPr>
+                <w:sz w:val="20"/>
+              </w:rPr>
+              <w:t>[tr]</w:t>
+            </w:r>
+            <w:r>
+              <w:br/>
+            </w:r>
+            <w:r>
+              <w:rPr>
+                <w:sz w:val="20"/>
+              </w:rPr>
+              <w:t>[td]6/29[/td]</w:t>
+            </w:r>
+            <w:r>
+              <w:br/>
+            </w:r>
+            <w:r>
+              <w:rPr>
+                <w:sz w:val="20"/>
+              </w:rPr>
+              <w:t>[td]-16.43亿[/td]</w:t>
+            </w:r>
+            <w:r>
+              <w:br/>
+            </w:r>
+            <w:r>
+              <w:rPr>
+                <w:sz w:val="20"/>
+              </w:rPr>
+              <w:t>[td]约-16亿[/td]</w:t>
+            </w:r>
+            <w:r>
+              <w:br/>
+            </w:r>
+            <w:r>
+              <w:rPr>
+                <w:sz w:val="20"/>
+              </w:rPr>
+              <w:t>[td]约+20亿[/td]</w:t>
+            </w:r>
+            <w:r>
+              <w:br/>
+            </w:r>
+            <w:r>
+              <w:rPr>
+                <w:sz w:val="20"/>
+              </w:rPr>
+              <w:t>[td]游资派发确认[/td]</w:t>
+            </w:r>
+            <w:r>
+              <w:br/>
+            </w:r>
+            <w:r>
+              <w:rPr>
+                <w:sz w:val="20"/>
+              </w:rPr>
+              <w:t>[td]机构外资双卖+游资独攻[/td][/tr]</w:t>
+            </w:r>
+            <w:r>
+              <w:br/>
+            </w:r>
+            <w:r>
+              <w:rPr>
+                <w:sz w:val="20"/>
+              </w:rPr>
+              <w:t>[/table]</w:t>
+            </w:r>
+          </w:p>
+          <w:p>
+            <w:pPr>
+              <w:spacing w:line="276" w:lineRule="auto" w:after="100"/>
+            </w:pPr>
+            <w:r>
+              <w:rPr>
+                <w:sz w:val="20"/>
+              </w:rPr>
+              <w:t>这个龙虎榜AI分析正确吗？看着和6月22日有点像</w:t>
+            </w:r>
+          </w:p>
+        </w:tc>
+      </w:tr>
+    </w:tbl>
+    <w:p>
+      <w:pPr>
+        <w:spacing w:after="40"/>
+      </w:pPr>
+    </w:p>
+    <w:tbl>
+      <w:tblPr>
+        <w:tblStyle w:val="TableGrid"/>
+        <w:tblW w:type="auto" w:w="0"/>
+        <w:tblLook w:firstColumn="1" w:firstRow="1" w:lastColumn="0" w:lastRow="0" w:noHBand="0" w:noVBand="1" w:val="04A0"/>
+      </w:tblPr>
+      <w:tblGrid>
+        <w:gridCol w:w="10080"/>
+      </w:tblGrid>
+      <w:tr>
+        <w:tc>
+          <w:tcPr>
+            <w:tcW w:type="dxa" w:w="10080"/>
+            <w:shd w:fill="F3F4F6"/>
+          </w:tcPr>
+          <w:p>
+            <w:pPr>
+              <w:spacing w:after="0"/>
+            </w:pPr>
+            <w:r>
+              <w:rPr>
+                <w:b/>
+                <w:color w:val="374151"/>
+                <w:sz w:val="19"/>
+              </w:rPr>
+              <w:t>2026-06-29 20:47  |  1513楼  |  xbox  |  UID 331181</w:t>
+            </w:r>
+          </w:p>
+        </w:tc>
+      </w:tr>
+      <w:tr>
+        <w:tc>
+          <w:tcPr>
+            <w:tcW w:type="dxa" w:w="10080"/>
+          </w:tcPr>
+          <w:p>
+            <w:pPr>
+              <w:spacing w:line="276" w:lineRule="auto" w:after="100"/>
+            </w:pPr>
+            <w:r>
+              <w:rPr>
+                <w:sz w:val="20"/>
+              </w:rPr>
+              <w:t>Reply Post by nirnip (2026-06-29 20:44):</w:t>
+            </w:r>
+          </w:p>
+          <w:p>
+            <w:pPr>
+              <w:spacing w:line="276" w:lineRule="auto" w:after="100"/>
+            </w:pPr>
+            <w:r>
+              <w:rPr>
+                <w:sz w:val="20"/>
+              </w:rPr>
+              <w:t>看了楼上说的几个材料的国产替代，不都翻倍了，下半年还能翻倍么？</w:t>
+            </w:r>
+          </w:p>
+          <w:p>
+            <w:pPr>
+              <w:spacing w:line="276" w:lineRule="auto" w:after="100"/>
+            </w:pPr>
+            <w:r>
+              <w:rPr>
+                <w:sz w:val="20"/>
+              </w:rPr>
+              <w:t>材料比设备涨的晚，说材料才1浪尾巴，预计回调后下半年的后劲要比设备强</w:t>
+            </w:r>
+          </w:p>
+        </w:tc>
+      </w:tr>
+    </w:tbl>
+    <w:p>
+      <w:pPr>
+        <w:spacing w:after="40"/>
+      </w:pPr>
+    </w:p>
+    <w:tbl>
+      <w:tblPr>
+        <w:tblStyle w:val="TableGrid"/>
+        <w:tblW w:type="auto" w:w="0"/>
+        <w:tblLook w:firstColumn="1" w:firstRow="1" w:lastColumn="0" w:lastRow="0" w:noHBand="0" w:noVBand="1" w:val="04A0"/>
+      </w:tblPr>
+      <w:tblGrid>
+        <w:gridCol w:w="10080"/>
+      </w:tblGrid>
+      <w:tr>
+        <w:tc>
+          <w:tcPr>
+            <w:tcW w:type="dxa" w:w="10080"/>
+            <w:shd w:fill="F3F4F6"/>
+          </w:tcPr>
+          <w:p>
+            <w:pPr>
+              <w:spacing w:after="0"/>
+            </w:pPr>
+            <w:r>
+              <w:rPr>
+                <w:b/>
+                <w:color w:val="374151"/>
+                <w:sz w:val="19"/>
+              </w:rPr>
+              <w:t>2026-06-29 21:04  |  1514楼  |  xbox  |  UID 331181</w:t>
+            </w:r>
+          </w:p>
+        </w:tc>
+      </w:tr>
+      <w:tr>
+        <w:tc>
+          <w:tcPr>
+            <w:tcW w:type="dxa" w:w="10080"/>
+          </w:tcPr>
+          <w:p>
+            <w:pPr>
+              <w:spacing w:line="276" w:lineRule="auto" w:after="100"/>
+            </w:pPr>
+            <w:r>
+              <w:rPr>
+                <w:sz w:val="20"/>
+              </w:rPr>
+              <w:t>Reply Post by gsctsxlz2012 (2026-06-29 20:59):</w:t>
+            </w:r>
+          </w:p>
+          <w:p>
+            <w:pPr>
+              <w:spacing w:line="276" w:lineRule="auto" w:after="100"/>
+            </w:pPr>
+            <w:r>
+              <w:rPr>
+                <w:sz w:val="20"/>
+              </w:rPr>
+              <w:t>感谢图哥的指导，感谢狼大的指导。</w:t>
+            </w:r>
+            <w:r>
+              <w:br/>
+            </w:r>
+            <w:r>
+              <w:rPr>
+                <w:sz w:val="20"/>
+              </w:rPr>
+              <w:t>2027年度半导设备小表格图哥(菜鸡图)已分享。</w:t>
+            </w:r>
+            <w:r>
+              <w:br/>
+            </w:r>
+            <w:r>
+              <w:rPr>
+                <w:sz w:val="20"/>
+              </w:rPr>
+              <w:t>这一次半导设备没吃到的，可以备战2027年，基金调仓波动较大风平浪静后再去建仓。</w:t>
+            </w:r>
+          </w:p>
+          <w:p>
+            <w:pPr>
+              <w:spacing w:line="276" w:lineRule="auto" w:after="100"/>
+            </w:pPr>
+            <w:r>
+              <w:rPr>
+                <w:sz w:val="20"/>
+              </w:rPr>
+              <w:t>我只看到了不少设备票还能翻倍 [s:ac:哭笑]</w:t>
+            </w:r>
+          </w:p>
+          <w:p>
+            <w:pPr>
+              <w:spacing w:line="276" w:lineRule="auto" w:after="100"/>
+            </w:pPr>
+            <w:r>
+              <w:rPr>
+                <w:sz w:val="20"/>
+              </w:rPr>
+              <w:t>铁盒还能再战</w:t>
+            </w:r>
+          </w:p>
+        </w:tc>
+      </w:tr>
+    </w:tbl>
+    <w:p>
+      <w:pPr>
+        <w:spacing w:after="40"/>
+      </w:pPr>
+    </w:p>
+    <w:tbl>
+      <w:tblPr>
+        <w:tblStyle w:val="TableGrid"/>
+        <w:tblW w:type="auto" w:w="0"/>
+        <w:tblLook w:firstColumn="1" w:firstRow="1" w:lastColumn="0" w:lastRow="0" w:noHBand="0" w:noVBand="1" w:val="04A0"/>
+      </w:tblPr>
+      <w:tblGrid>
+        <w:gridCol w:w="10080"/>
+      </w:tblGrid>
+      <w:tr>
+        <w:tc>
+          <w:tcPr>
+            <w:tcW w:type="dxa" w:w="10080"/>
+            <w:shd w:fill="F3F4F6"/>
+          </w:tcPr>
+          <w:p>
+            <w:pPr>
+              <w:spacing w:after="0"/>
+            </w:pPr>
+            <w:r>
+              <w:rPr>
+                <w:b/>
+                <w:color w:val="374151"/>
+                <w:sz w:val="19"/>
+              </w:rPr>
+              <w:t>2026-06-29 21:41  |  364楼  |  Plezl  |  UID 67145714</w:t>
+            </w:r>
+          </w:p>
+        </w:tc>
+      </w:tr>
+      <w:tr>
+        <w:tc>
+          <w:tcPr>
+            <w:tcW w:type="dxa" w:w="10080"/>
+          </w:tcPr>
+          <w:p>
+            <w:pPr>
+              <w:spacing w:line="276" w:lineRule="auto" w:after="100"/>
+            </w:pPr>
+            <w:r>
+              <w:rPr>
+                <w:sz w:val="20"/>
+              </w:rPr>
+              <w:t>./mon_202606/29/jmQ86-j4prZbT3cSsg-n0.png</w:t>
+            </w:r>
+          </w:p>
+        </w:tc>
+      </w:tr>
+    </w:tbl>
+    <w:p>
+      <w:pPr>
+        <w:spacing w:after="40"/>
+      </w:pPr>
+    </w:p>
+    <w:tbl>
+      <w:tblPr>
+        <w:tblStyle w:val="TableGrid"/>
+        <w:tblW w:type="auto" w:w="0"/>
+        <w:tblLook w:firstColumn="1" w:firstRow="1" w:lastColumn="0" w:lastRow="0" w:noHBand="0" w:noVBand="1" w:val="04A0"/>
+      </w:tblPr>
+      <w:tblGrid>
+        <w:gridCol w:w="10080"/>
+      </w:tblGrid>
+      <w:tr>
+        <w:tc>
+          <w:tcPr>
+            <w:tcW w:type="dxa" w:w="10080"/>
+            <w:shd w:fill="F3F4F6"/>
+          </w:tcPr>
+          <w:p>
+            <w:pPr>
+              <w:spacing w:after="0"/>
+            </w:pPr>
+            <w:r>
+              <w:rPr>
+                <w:b/>
+                <w:color w:val="374151"/>
+                <w:sz w:val="19"/>
+              </w:rPr>
+              <w:t>2026-06-29 22:18  |  1525楼  |  包子music  |  UID 42162697</w:t>
+            </w:r>
+          </w:p>
+        </w:tc>
+      </w:tr>
+      <w:tr>
+        <w:tc>
+          <w:tcPr>
+            <w:tcW w:type="dxa" w:w="10080"/>
+          </w:tcPr>
+          <w:p>
+            <w:pPr>
+              <w:spacing w:line="276" w:lineRule="auto" w:after="100"/>
+            </w:pPr>
+            <w:r>
+              <w:rPr>
+                <w:sz w:val="20"/>
+              </w:rPr>
+              <w:t>[del]在不为人知的角落，我把长线逻辑讨出来了，算不算大功一件[/del]</w:t>
+            </w:r>
+          </w:p>
+        </w:tc>
+      </w:tr>
+    </w:tbl>
+    <w:p>
+      <w:pPr>
+        <w:spacing w:after="40"/>
+      </w:pPr>
+    </w:p>
+    <w:tbl>
+      <w:tblPr>
+        <w:tblStyle w:val="TableGrid"/>
+        <w:tblW w:type="auto" w:w="0"/>
+        <w:tblLook w:firstColumn="1" w:firstRow="1" w:lastColumn="0" w:lastRow="0" w:noHBand="0" w:noVBand="1" w:val="04A0"/>
+      </w:tblPr>
+      <w:tblGrid>
+        <w:gridCol w:w="10080"/>
+      </w:tblGrid>
+      <w:tr>
+        <w:tc>
+          <w:tcPr>
+            <w:tcW w:type="dxa" w:w="10080"/>
+            <w:shd w:fill="F3F4F6"/>
+          </w:tcPr>
+          <w:p>
+            <w:pPr>
+              <w:spacing w:after="0"/>
+            </w:pPr>
+            <w:r>
+              <w:rPr>
+                <w:b/>
+                <w:color w:val="374151"/>
+                <w:sz w:val="19"/>
+              </w:rPr>
+              <w:t>2026-06-29 22:29  |  1526楼  |  包子music  |  UID 42162697</w:t>
+            </w:r>
+          </w:p>
+        </w:tc>
+      </w:tr>
+      <w:tr>
+        <w:tc>
+          <w:tcPr>
+            <w:tcW w:type="dxa" w:w="10080"/>
+          </w:tcPr>
+          <w:p>
+            <w:pPr>
+              <w:spacing w:line="276" w:lineRule="auto" w:after="100"/>
+            </w:pPr>
+            <w:r>
+              <w:rPr>
+                <w:sz w:val="20"/>
+              </w:rPr>
+              <w:t>Reply to Reply Post by deathgodl (2026-06-29 22:27)</w:t>
+            </w:r>
+          </w:p>
+          <w:p>
+            <w:pPr>
+              <w:spacing w:line="276" w:lineRule="auto" w:after="100"/>
+            </w:pPr>
+            <w:r>
+              <w:rPr>
+                <w:sz w:val="20"/>
+              </w:rPr>
+              <w:t>同感，我家父也一直关注，他认为宁王药明绝对是21年吃药喝酒行情以来最被错付的两个标</w:t>
+            </w:r>
+          </w:p>
+          <w:p>
+            <w:pPr>
+              <w:spacing w:line="276" w:lineRule="auto" w:after="100"/>
+            </w:pPr>
+            <w:r>
+              <w:rPr>
+                <w:sz w:val="20"/>
+              </w:rPr>
+              <w:t>看看AH股的价差，文指导带货蓝旗的时候，又有人瞥一眼严重错配的宁王呢</w:t>
+            </w:r>
+          </w:p>
+        </w:tc>
+      </w:tr>
+    </w:tbl>
+    <w:p>
+      <w:pPr>
+        <w:spacing w:after="40"/>
+      </w:pPr>
+    </w:p>
+    <w:tbl>
+      <w:tblPr>
+        <w:tblStyle w:val="TableGrid"/>
+        <w:tblW w:type="auto" w:w="0"/>
+        <w:tblLook w:firstColumn="1" w:firstRow="1" w:lastColumn="0" w:lastRow="0" w:noHBand="0" w:noVBand="1" w:val="04A0"/>
+      </w:tblPr>
+      <w:tblGrid>
+        <w:gridCol w:w="10080"/>
+      </w:tblGrid>
+      <w:tr>
+        <w:tc>
+          <w:tcPr>
+            <w:tcW w:type="dxa" w:w="10080"/>
+            <w:shd w:fill="F3F4F6"/>
+          </w:tcPr>
+          <w:p>
+            <w:pPr>
+              <w:spacing w:after="0"/>
+            </w:pPr>
+            <w:r>
+              <w:rPr>
+                <w:b/>
+                <w:color w:val="374151"/>
+                <w:sz w:val="19"/>
+              </w:rPr>
+              <w:t>2026-06-29 22:39  |  2984楼  |  Rzzz二号机  |  UID 67143809</w:t>
+            </w:r>
+          </w:p>
+        </w:tc>
+      </w:tr>
+      <w:tr>
+        <w:tc>
+          <w:tcPr>
+            <w:tcW w:type="dxa" w:w="10080"/>
+          </w:tcPr>
+          <w:p>
+            <w:pPr>
+              <w:spacing w:line="276" w:lineRule="auto" w:after="100"/>
+            </w:pPr>
+            <w:r>
+              <w:rPr>
+                <w:sz w:val="20"/>
+              </w:rPr>
+              <w:t>Reply Post by Amam2haruna (2026-06-29 21:49):</w:t>
+            </w:r>
+          </w:p>
+          <w:p>
+            <w:pPr>
+              <w:spacing w:line="276" w:lineRule="auto" w:after="100"/>
+            </w:pPr>
+            <w:r>
+              <w:rPr>
+                <w:sz w:val="20"/>
+              </w:rPr>
+              <w:t>胜宏科技：公司已有部分ASIC相关PCB产品进行批量生产</w:t>
+            </w:r>
+            <w:r>
+              <w:br/>
+            </w:r>
+            <w:r>
+              <w:rPr>
+                <w:sz w:val="20"/>
+              </w:rPr>
+              <w:t>金十数据6月29日讯，胜宏科技在现场参观时表示，目前公司已有部分ASIC相关PCB产品进行批量生产，业务进展顺利。公司在惠州配置了mSAP车间，该产能目前用于满足1.6T光模块的生产需求，当前在手订单饱满，产能利用率处于良好水平。目前mSAP产能需求旺盛，公司与相关客户保持密切沟通，将围绕客户需求进行产能布局。此外，公司正积极推进CoWop技术的研发及生产工作，该技术需同时具备高阶HDI和mSAP工艺能力，预计相关PCB产品价值量将有较大</w:t>
+            </w:r>
+          </w:p>
+          <w:p>
+            <w:pPr>
+              <w:spacing w:line="276" w:lineRule="auto" w:after="100"/>
+            </w:pPr>
+            <w:r>
+              <w:rPr>
+                <w:sz w:val="20"/>
+              </w:rPr>
+              <w:t>[s:pg:严肃]明天&amp;#10133;10之前 我不会替牢弟说一句话的</w:t>
+            </w:r>
+          </w:p>
+        </w:tc>
+      </w:tr>
+    </w:tbl>
+    <w:p>
+      <w:pPr>
+        <w:spacing w:after="40"/>
+      </w:pPr>
+    </w:p>
+    <w:tbl>
+      <w:tblPr>
+        <w:tblStyle w:val="TableGrid"/>
+        <w:tblW w:type="auto" w:w="0"/>
+        <w:tblLook w:firstColumn="1" w:firstRow="1" w:lastColumn="0" w:lastRow="0" w:noHBand="0" w:noVBand="1" w:val="04A0"/>
+      </w:tblPr>
+      <w:tblGrid>
+        <w:gridCol w:w="10080"/>
+      </w:tblGrid>
+      <w:tr>
+        <w:tc>
+          <w:tcPr>
+            <w:tcW w:type="dxa" w:w="10080"/>
+            <w:shd w:fill="F3F4F6"/>
+          </w:tcPr>
+          <w:p>
+            <w:pPr>
+              <w:spacing w:after="0"/>
+            </w:pPr>
+            <w:r>
+              <w:rPr>
+                <w:b/>
+                <w:color w:val="374151"/>
+                <w:sz w:val="19"/>
+              </w:rPr>
+              <w:t>2026-06-29 22:47  |  1527楼  |  包子music  |  UID 42162697</w:t>
+            </w:r>
+          </w:p>
+        </w:tc>
+      </w:tr>
+      <w:tr>
+        <w:tc>
+          <w:tcPr>
+            <w:tcW w:type="dxa" w:w="10080"/>
+          </w:tcPr>
+          <w:p>
+            <w:pPr>
+              <w:spacing w:line="276" w:lineRule="auto" w:after="100"/>
+            </w:pPr>
+            <w:r>
+              <w:rPr>
+                <w:sz w:val="20"/>
+              </w:rPr>
+              <w:t>Reply to Reply Post by 八月_Auga (2026-06-29 22:44)</w:t>
+            </w:r>
+          </w:p>
+          <w:p>
+            <w:pPr>
+              <w:spacing w:line="276" w:lineRule="auto" w:after="100"/>
+            </w:pPr>
+            <w:r>
+              <w:rPr>
+                <w:sz w:val="20"/>
+              </w:rPr>
+              <w:t>买便宜的铲子</w:t>
+            </w:r>
+            <w:r>
+              <w:br/>
+            </w:r>
+            <w:r>
+              <w:rPr>
+                <w:sz w:val="20"/>
+              </w:rPr>
+              <w:t>为什么便宜，铲什么东西别问，那是司机的考虑</w:t>
+            </w:r>
+            <w:r>
+              <w:br/>
+            </w:r>
+            <w:r>
+              <w:rPr>
+                <w:sz w:val="20"/>
+              </w:rPr>
+              <w:t>这个逻辑我觉得适用于所有的设备材料和很多标的。我要学习的就是为什么便宜，铲什么东西，来算自己的小表格[s:ac:blink]</w:t>
+            </w:r>
+          </w:p>
+        </w:tc>
+      </w:tr>
+    </w:tbl>
+    <w:p>
+      <w:pPr>
+        <w:spacing w:after="40"/>
+      </w:pPr>
+    </w:p>
+    <w:tbl>
+      <w:tblPr>
+        <w:tblStyle w:val="TableGrid"/>
+        <w:tblW w:type="auto" w:w="0"/>
+        <w:tblLook w:firstColumn="1" w:firstRow="1" w:lastColumn="0" w:lastRow="0" w:noHBand="0" w:noVBand="1" w:val="04A0"/>
+      </w:tblPr>
+      <w:tblGrid>
+        <w:gridCol w:w="10080"/>
+      </w:tblGrid>
+      <w:tr>
+        <w:tc>
+          <w:tcPr>
+            <w:tcW w:type="dxa" w:w="10080"/>
+            <w:shd w:fill="F3F4F6"/>
+          </w:tcPr>
+          <w:p>
+            <w:pPr>
+              <w:spacing w:after="0"/>
+            </w:pPr>
+            <w:r>
+              <w:rPr>
+                <w:b/>
+                <w:color w:val="374151"/>
+                <w:sz w:val="19"/>
+              </w:rPr>
+              <w:t>2026-06-29 23:41  |  1167楼  |  灰兔尾  |  UID 60916468</w:t>
+            </w:r>
+          </w:p>
+        </w:tc>
+      </w:tr>
+      <w:tr>
+        <w:tc>
+          <w:tcPr>
+            <w:tcW w:type="dxa" w:w="10080"/>
+          </w:tcPr>
+          <w:p>
+            <w:pPr>
+              <w:spacing w:line="276" w:lineRule="auto" w:after="100"/>
+            </w:pPr>
+            <w:r>
+              <w:rPr>
+                <w:sz w:val="20"/>
+              </w:rPr>
+              <w:t>我今天控仓的时候，一些票减得只剩利润仓了，仓位已经完全减不下去了，终于理解了狼大的那个七成仓是怎么来的了；给你们做个狼语翻译，以后狼大说七成仓，意思就是他只剩利润仓了，没利润垫的朋友可以把尾巴夹紧了</w:t>
+            </w:r>
+          </w:p>
+        </w:tc>
+      </w:tr>
+    </w:tbl>
+    <w:p>
+      <w:pPr>
+        <w:spacing w:after="40"/>
+      </w:pPr>
+    </w:p>
+    <w:tbl>
+      <w:tblPr>
+        <w:tblStyle w:val="TableGrid"/>
+        <w:tblW w:type="auto" w:w="0"/>
+        <w:tblLook w:firstColumn="1" w:firstRow="1" w:lastColumn="0" w:lastRow="0" w:noHBand="0" w:noVBand="1" w:val="04A0"/>
+      </w:tblPr>
+      <w:tblGrid>
+        <w:gridCol w:w="10080"/>
+      </w:tblGrid>
+      <w:tr>
+        <w:tc>
+          <w:tcPr>
+            <w:tcW w:type="dxa" w:w="10080"/>
+            <w:shd w:fill="F3F4F6"/>
+          </w:tcPr>
+          <w:p>
+            <w:pPr>
+              <w:spacing w:after="0"/>
+            </w:pPr>
+            <w:r>
+              <w:rPr>
+                <w:b/>
+                <w:color w:val="374151"/>
+                <w:sz w:val="19"/>
+              </w:rPr>
+              <w:t>2026-06-30 07:28  |  2985楼  |  Rzzz二号机  |  UID 67143809</w:t>
+            </w:r>
+          </w:p>
+        </w:tc>
+      </w:tr>
+      <w:tr>
+        <w:tc>
+          <w:tcPr>
+            <w:tcW w:type="dxa" w:w="10080"/>
+          </w:tcPr>
+          <w:p>
+            <w:pPr>
+              <w:spacing w:line="276" w:lineRule="auto" w:after="100"/>
+            </w:pPr>
+            <w:r>
+              <w:rPr>
+                <w:sz w:val="20"/>
+              </w:rPr>
+              <w:t>Reply Post by Amam2haruna (2026-06-30 00:14):</w:t>
+            </w:r>
+          </w:p>
+          <w:p>
+            <w:pPr>
+              <w:spacing w:line="276" w:lineRule="auto" w:after="100"/>
+            </w:pPr>
+            <w:r>
+              <w:rPr>
+                <w:sz w:val="20"/>
+              </w:rPr>
+              <w:t>[s:pg:严肃]你说的是真+10%还是牢弟特色+10%</w:t>
+            </w:r>
+          </w:p>
+          <w:p>
+            <w:pPr>
+              <w:spacing w:line="276" w:lineRule="auto" w:after="100"/>
+            </w:pPr>
+            <w:r>
+              <w:rPr>
+                <w:sz w:val="20"/>
+              </w:rPr>
+              <w:t>[s:pg:严肃]那我换个说法+100%</w:t>
+            </w:r>
+          </w:p>
+        </w:tc>
+      </w:tr>
+    </w:tbl>
+    <w:p>
+      <w:pPr>
+        <w:spacing w:after="40"/>
+      </w:pPr>
+    </w:p>
+    <w:tbl>
+      <w:tblPr>
+        <w:tblStyle w:val="TableGrid"/>
+        <w:tblW w:type="auto" w:w="0"/>
+        <w:tblLook w:firstColumn="1" w:firstRow="1" w:lastColumn="0" w:lastRow="0" w:noHBand="0" w:noVBand="1" w:val="04A0"/>
+      </w:tblPr>
+      <w:tblGrid>
+        <w:gridCol w:w="10080"/>
+      </w:tblGrid>
+      <w:tr>
+        <w:tc>
+          <w:tcPr>
+            <w:tcW w:type="dxa" w:w="10080"/>
+            <w:shd w:fill="F3F4F6"/>
+          </w:tcPr>
+          <w:p>
+            <w:pPr>
+              <w:spacing w:after="0"/>
+            </w:pPr>
+            <w:r>
+              <w:rPr>
+                <w:b/>
+                <w:color w:val="374151"/>
+                <w:sz w:val="19"/>
+              </w:rPr>
+              <w:t>2026-06-30 09:07  |  2987楼  |  Rzzz二号机  |  UID 67143809</w:t>
+            </w:r>
+          </w:p>
+        </w:tc>
+      </w:tr>
+      <w:tr>
+        <w:tc>
+          <w:tcPr>
+            <w:tcW w:type="dxa" w:w="10080"/>
+          </w:tcPr>
+          <w:p>
+            <w:pPr>
+              <w:spacing w:line="276" w:lineRule="auto" w:after="100"/>
+            </w:pPr>
+            <w:r>
+              <w:rPr>
+                <w:sz w:val="20"/>
+              </w:rPr>
+              <w:t>看来今天或为低开 [s:ac:瞎]</w:t>
+            </w:r>
+          </w:p>
+        </w:tc>
+      </w:tr>
+    </w:tbl>
+    <w:p>
+      <w:pPr>
+        <w:spacing w:after="40"/>
+      </w:pPr>
+    </w:p>
+    <w:tbl>
+      <w:tblPr>
+        <w:tblStyle w:val="TableGrid"/>
+        <w:tblW w:type="auto" w:w="0"/>
+        <w:tblLook w:firstColumn="1" w:firstRow="1" w:lastColumn="0" w:lastRow="0" w:noHBand="0" w:noVBand="1" w:val="04A0"/>
+      </w:tblPr>
+      <w:tblGrid>
+        <w:gridCol w:w="10080"/>
+      </w:tblGrid>
+      <w:tr>
+        <w:tc>
+          <w:tcPr>
+            <w:tcW w:type="dxa" w:w="10080"/>
+            <w:shd w:fill="F3F4F6"/>
+          </w:tcPr>
+          <w:p>
+            <w:pPr>
+              <w:spacing w:after="0"/>
+            </w:pPr>
+            <w:r>
+              <w:rPr>
+                <w:b/>
+                <w:color w:val="374151"/>
+                <w:sz w:val="19"/>
+              </w:rPr>
+              <w:t>2026-06-30 09:33  |  2988楼  |  Rzzz二号机  |  UID 67143809</w:t>
+            </w:r>
+          </w:p>
+        </w:tc>
+      </w:tr>
+      <w:tr>
+        <w:tc>
+          <w:tcPr>
+            <w:tcW w:type="dxa" w:w="10080"/>
+          </w:tcPr>
+          <w:p>
+            <w:pPr>
+              <w:spacing w:line="276" w:lineRule="auto" w:after="100"/>
+            </w:pPr>
+            <w:r>
+              <w:rPr>
+                <w:sz w:val="20"/>
+              </w:rPr>
+              <w:t>[s:pg:严肃]喜欢叫</w:t>
+            </w:r>
+          </w:p>
+        </w:tc>
+      </w:tr>
+    </w:tbl>
+    <w:p>
+      <w:pPr>
+        <w:spacing w:after="40"/>
+      </w:pPr>
+    </w:p>
+    <w:tbl>
+      <w:tblPr>
+        <w:tblStyle w:val="TableGrid"/>
+        <w:tblW w:type="auto" w:w="0"/>
+        <w:tblLook w:firstColumn="1" w:firstRow="1" w:lastColumn="0" w:lastRow="0" w:noHBand="0" w:noVBand="1" w:val="04A0"/>
+      </w:tblPr>
+      <w:tblGrid>
+        <w:gridCol w:w="10080"/>
+      </w:tblGrid>
+      <w:tr>
+        <w:tc>
+          <w:tcPr>
+            <w:tcW w:type="dxa" w:w="10080"/>
+            <w:shd w:fill="F3F4F6"/>
+          </w:tcPr>
+          <w:p>
+            <w:pPr>
+              <w:spacing w:after="0"/>
+            </w:pPr>
+            <w:r>
+              <w:rPr>
+                <w:b/>
+                <w:color w:val="374151"/>
+                <w:sz w:val="19"/>
+              </w:rPr>
+              <w:t>2026-06-30 09:42  |  2989楼  |  Rzzz二号机  |  UID 67143809</w:t>
+            </w:r>
+          </w:p>
+        </w:tc>
+      </w:tr>
+      <w:tr>
+        <w:tc>
+          <w:tcPr>
+            <w:tcW w:type="dxa" w:w="10080"/>
+          </w:tcPr>
+          <w:p>
+            <w:pPr>
+              <w:spacing w:line="276" w:lineRule="auto" w:after="100"/>
+            </w:pPr>
+            <w:r>
+              <w:rPr>
+                <w:sz w:val="20"/>
+              </w:rPr>
+              <w:t>[s:a2:jojo立2]今天我不希望听到任何笑话</w:t>
+            </w:r>
+            <w:r>
+              <w:br/>
+            </w:r>
+            <w:r>
+              <w:rPr>
+                <w:sz w:val="20"/>
+              </w:rPr>
+              <w:t>另外 给胜胜的宏道歉</w:t>
+            </w:r>
+          </w:p>
+        </w:tc>
+      </w:tr>
+    </w:tbl>
+    <w:p>
+      <w:pPr>
+        <w:spacing w:after="40"/>
+      </w:pPr>
+    </w:p>
+    <w:tbl>
+      <w:tblPr>
+        <w:tblStyle w:val="TableGrid"/>
+        <w:tblW w:type="auto" w:w="0"/>
+        <w:tblLook w:firstColumn="1" w:firstRow="1" w:lastColumn="0" w:lastRow="0" w:noHBand="0" w:noVBand="1" w:val="04A0"/>
+      </w:tblPr>
+      <w:tblGrid>
+        <w:gridCol w:w="10080"/>
+      </w:tblGrid>
+      <w:tr>
+        <w:tc>
+          <w:tcPr>
+            <w:tcW w:type="dxa" w:w="10080"/>
+            <w:shd w:fill="F3F4F6"/>
+          </w:tcPr>
+          <w:p>
+            <w:pPr>
+              <w:spacing w:after="0"/>
+            </w:pPr>
+            <w:r>
+              <w:rPr>
+                <w:b/>
+                <w:color w:val="374151"/>
+                <w:sz w:val="19"/>
+              </w:rPr>
+              <w:t>2026-06-30 09:49  |  1516楼  |  xbox  |  UID 331181</w:t>
+            </w:r>
+          </w:p>
+        </w:tc>
+      </w:tr>
+      <w:tr>
+        <w:tc>
+          <w:tcPr>
+            <w:tcW w:type="dxa" w:w="10080"/>
+          </w:tcPr>
+          <w:p>
+            <w:pPr>
+              <w:spacing w:line="276" w:lineRule="auto" w:after="100"/>
+            </w:pPr>
+            <w:r>
+              <w:rPr>
+                <w:sz w:val="20"/>
+              </w:rPr>
+              <w:t>光在20日线反弹，能不能保持趋势不变</w:t>
+            </w:r>
+          </w:p>
+        </w:tc>
+      </w:tr>
+    </w:tbl>
+    <w:p>
+      <w:pPr>
+        <w:spacing w:after="40"/>
+      </w:pPr>
+    </w:p>
+    <w:tbl>
+      <w:tblPr>
+        <w:tblStyle w:val="TableGrid"/>
+        <w:tblW w:type="auto" w:w="0"/>
+        <w:tblLook w:firstColumn="1" w:firstRow="1" w:lastColumn="0" w:lastRow="0" w:noHBand="0" w:noVBand="1" w:val="04A0"/>
+      </w:tblPr>
+      <w:tblGrid>
+        <w:gridCol w:w="10080"/>
+      </w:tblGrid>
+      <w:tr>
+        <w:tc>
+          <w:tcPr>
+            <w:tcW w:type="dxa" w:w="10080"/>
+            <w:shd w:fill="F3F4F6"/>
+          </w:tcPr>
+          <w:p>
+            <w:pPr>
+              <w:spacing w:after="0"/>
+            </w:pPr>
+            <w:r>
+              <w:rPr>
+                <w:b/>
+                <w:color w:val="374151"/>
+                <w:sz w:val="19"/>
+              </w:rPr>
+              <w:t>2026-06-30 09:51  |  2990楼  |  Rzzz二号机  |  UID 67143809</w:t>
+            </w:r>
+          </w:p>
+        </w:tc>
+      </w:tr>
+      <w:tr>
+        <w:tc>
+          <w:tcPr>
+            <w:tcW w:type="dxa" w:w="10080"/>
+          </w:tcPr>
+          <w:p>
+            <w:pPr>
+              <w:spacing w:line="276" w:lineRule="auto" w:after="100"/>
+            </w:pPr>
+            <w:r>
+              <w:rPr>
+                <w:sz w:val="20"/>
+              </w:rPr>
+              <w:t>Reply Post by aot10086 (2026-06-30 09:49):</w:t>
+            </w:r>
+          </w:p>
+          <w:p>
+            <w:pPr>
+              <w:spacing w:line="276" w:lineRule="auto" w:after="100"/>
+            </w:pPr>
+            <w:r>
+              <w:rPr>
+                <w:sz w:val="20"/>
+              </w:rPr>
+              <w:t>./mon_202606/30/jmQ39-9c8jK2T8S1r-10.jpg机哥机哥，我刚不小心点错线了，为什么他的月线还是绿的呀</w:t>
+            </w:r>
+          </w:p>
+          <w:p>
+            <w:pPr>
+              <w:spacing w:line="276" w:lineRule="auto" w:after="100"/>
+            </w:pPr>
+            <w:r>
+              <w:rPr>
+                <w:sz w:val="20"/>
+              </w:rPr>
+              <w:t>[s:pg:嘣2]枪毙名单加1 一个月后打开K线捅死你</w:t>
+            </w:r>
+          </w:p>
+        </w:tc>
+      </w:tr>
+    </w:tbl>
+    <w:p>
+      <w:pPr>
+        <w:spacing w:after="40"/>
+      </w:pPr>
+    </w:p>
+    <w:tbl>
+      <w:tblPr>
+        <w:tblStyle w:val="TableGrid"/>
+        <w:tblW w:type="auto" w:w="0"/>
+        <w:tblLook w:firstColumn="1" w:firstRow="1" w:lastColumn="0" w:lastRow="0" w:noHBand="0" w:noVBand="1" w:val="04A0"/>
+      </w:tblPr>
+      <w:tblGrid>
+        <w:gridCol w:w="10080"/>
+      </w:tblGrid>
+      <w:tr>
+        <w:tc>
+          <w:tcPr>
+            <w:tcW w:type="dxa" w:w="10080"/>
+            <w:shd w:fill="F3F4F6"/>
+          </w:tcPr>
+          <w:p>
+            <w:pPr>
+              <w:spacing w:after="0"/>
+            </w:pPr>
+            <w:r>
+              <w:rPr>
+                <w:b/>
+                <w:color w:val="374151"/>
+                <w:sz w:val="19"/>
+              </w:rPr>
+              <w:t>2026-06-30 09:54  |  2991楼  |  Rzzz二号机  |  UID 67143809</w:t>
+            </w:r>
+          </w:p>
+        </w:tc>
+      </w:tr>
+      <w:tr>
+        <w:tc>
+          <w:tcPr>
+            <w:tcW w:type="dxa" w:w="10080"/>
+          </w:tcPr>
+          <w:p>
+            <w:pPr>
+              <w:spacing w:line="276" w:lineRule="auto" w:after="100"/>
+            </w:pPr>
+            <w:r>
+              <w:rPr>
+                <w:sz w:val="20"/>
+              </w:rPr>
+              <w:t>以下是今日枪毙名单</w:t>
+            </w:r>
+            <w:r>
+              <w:br/>
+            </w:r>
+            <w:r>
+              <w:rPr>
+                <w:sz w:val="20"/>
+              </w:rPr>
+              <w:t>aot10086</w:t>
+            </w:r>
+            <w:r>
+              <w:br/>
+            </w:r>
+            <w:r>
+              <w:rPr>
+                <w:sz w:val="20"/>
+              </w:rPr>
+              <w:t>huohuo277</w:t>
+            </w:r>
+          </w:p>
+          <w:p>
+            <w:pPr>
+              <w:spacing w:line="276" w:lineRule="auto" w:after="100"/>
+            </w:pPr>
+            <w:r>
+              <w:rPr>
+                <w:sz w:val="20"/>
+              </w:rPr>
+              <w:t>排名不分先后 喷子一起穿[s:pg:嘣2]</w:t>
+            </w:r>
+          </w:p>
+        </w:tc>
+      </w:tr>
+    </w:tbl>
+    <w:p>
+      <w:pPr>
+        <w:spacing w:after="40"/>
+      </w:pPr>
+    </w:p>
+    <w:tbl>
+      <w:tblPr>
+        <w:tblStyle w:val="TableGrid"/>
+        <w:tblW w:type="auto" w:w="0"/>
+        <w:tblLook w:firstColumn="1" w:firstRow="1" w:lastColumn="0" w:lastRow="0" w:noHBand="0" w:noVBand="1" w:val="04A0"/>
+      </w:tblPr>
+      <w:tblGrid>
+        <w:gridCol w:w="10080"/>
+      </w:tblGrid>
+      <w:tr>
+        <w:tc>
+          <w:tcPr>
+            <w:tcW w:type="dxa" w:w="10080"/>
+            <w:shd w:fill="F3F4F6"/>
+          </w:tcPr>
+          <w:p>
+            <w:pPr>
+              <w:spacing w:after="0"/>
+            </w:pPr>
+            <w:r>
+              <w:rPr>
+                <w:b/>
+                <w:color w:val="374151"/>
+                <w:sz w:val="19"/>
+              </w:rPr>
+              <w:t>2026-06-30 10:07  |  1517楼  |  xbox  |  UID 331181</w:t>
+            </w:r>
+          </w:p>
+        </w:tc>
+      </w:tr>
+      <w:tr>
+        <w:tc>
+          <w:tcPr>
+            <w:tcW w:type="dxa" w:w="10080"/>
+          </w:tcPr>
+          <w:p>
+            <w:pPr>
+              <w:spacing w:line="276" w:lineRule="auto" w:after="100"/>
+            </w:pPr>
+            <w:r>
+              <w:rPr>
+                <w:sz w:val="20"/>
+              </w:rPr>
+              <w:t>Reply Post by 你看看你？ (2026-06-30 10:04):</w:t>
+            </w:r>
+          </w:p>
+          <w:p>
+            <w:pPr>
+              <w:spacing w:line="276" w:lineRule="auto" w:after="100"/>
+            </w:pPr>
+            <w:r>
+              <w:rPr>
+                <w:sz w:val="20"/>
+              </w:rPr>
+              <w:t>日K呗，34买40卖，但是哪天起飞就不知道了，震荡这么久肯定有事要干</w:t>
+            </w:r>
+          </w:p>
+          <w:p>
+            <w:pPr>
+              <w:spacing w:line="276" w:lineRule="auto" w:after="100"/>
+            </w:pPr>
+            <w:r>
+              <w:rPr>
+                <w:sz w:val="20"/>
+              </w:rPr>
+              <w:t>参考铁盒ETF，日K下轨，昨天缩量站稳，量能缩到60天均量的2/3，我昨天加的以为要被埋了 [s:ac:冷]</w:t>
+            </w:r>
+          </w:p>
+          <w:p>
+            <w:pPr>
+              <w:spacing w:line="276" w:lineRule="auto" w:after="100"/>
+            </w:pPr>
+            <w:r>
+              <w:rPr>
+                <w:sz w:val="20"/>
+              </w:rPr>
+              <w:t>就怕日内T王</w:t>
+            </w:r>
+          </w:p>
+        </w:tc>
+      </w:tr>
+    </w:tbl>
+    <w:p>
+      <w:pPr>
+        <w:spacing w:after="40"/>
+      </w:pPr>
+    </w:p>
+    <w:tbl>
+      <w:tblPr>
+        <w:tblStyle w:val="TableGrid"/>
+        <w:tblW w:type="auto" w:w="0"/>
+        <w:tblLook w:firstColumn="1" w:firstRow="1" w:lastColumn="0" w:lastRow="0" w:noHBand="0" w:noVBand="1" w:val="04A0"/>
+      </w:tblPr>
+      <w:tblGrid>
+        <w:gridCol w:w="10080"/>
+      </w:tblGrid>
+      <w:tr>
+        <w:tc>
+          <w:tcPr>
+            <w:tcW w:type="dxa" w:w="10080"/>
+            <w:shd w:fill="F3F4F6"/>
+          </w:tcPr>
+          <w:p>
+            <w:pPr>
+              <w:spacing w:after="0"/>
+            </w:pPr>
+            <w:r>
+              <w:rPr>
+                <w:b/>
+                <w:color w:val="374151"/>
+                <w:sz w:val="19"/>
+              </w:rPr>
+              <w:t>2026-06-30 10:14  |  1518楼  |  xbox  |  UID 331181</w:t>
+            </w:r>
+          </w:p>
+        </w:tc>
+      </w:tr>
+      <w:tr>
+        <w:tc>
+          <w:tcPr>
+            <w:tcW w:type="dxa" w:w="10080"/>
+          </w:tcPr>
+          <w:p>
+            <w:pPr>
+              <w:spacing w:line="276" w:lineRule="auto" w:after="100"/>
+            </w:pPr>
+            <w:r>
+              <w:rPr>
+                <w:sz w:val="20"/>
+              </w:rPr>
+              <w:t>京东方洗了两波，难道走主升了，连续10不破5日线</w:t>
+            </w:r>
+          </w:p>
+        </w:tc>
+      </w:tr>
+    </w:tbl>
+    <w:p>
+      <w:pPr>
+        <w:spacing w:after="40"/>
+      </w:pPr>
+    </w:p>
+    <w:tbl>
+      <w:tblPr>
+        <w:tblStyle w:val="TableGrid"/>
+        <w:tblW w:type="auto" w:w="0"/>
+        <w:tblLook w:firstColumn="1" w:firstRow="1" w:lastColumn="0" w:lastRow="0" w:noHBand="0" w:noVBand="1" w:val="04A0"/>
+      </w:tblPr>
+      <w:tblGrid>
+        <w:gridCol w:w="10080"/>
+      </w:tblGrid>
+      <w:tr>
+        <w:tc>
+          <w:tcPr>
+            <w:tcW w:type="dxa" w:w="10080"/>
+            <w:shd w:fill="F3F4F6"/>
+          </w:tcPr>
+          <w:p>
+            <w:pPr>
+              <w:spacing w:after="0"/>
+            </w:pPr>
+            <w:r>
+              <w:rPr>
+                <w:b/>
+                <w:color w:val="374151"/>
+                <w:sz w:val="19"/>
+              </w:rPr>
+              <w:t>2026-06-30 10:22  |  1519楼  |  xbox  |  UID 331181</w:t>
+            </w:r>
+          </w:p>
+        </w:tc>
+      </w:tr>
+      <w:tr>
+        <w:tc>
+          <w:tcPr>
+            <w:tcW w:type="dxa" w:w="10080"/>
+          </w:tcPr>
+          <w:p>
+            <w:pPr>
+              <w:spacing w:line="276" w:lineRule="auto" w:after="100"/>
+            </w:pPr>
+            <w:r>
+              <w:rPr>
+                <w:sz w:val="20"/>
+              </w:rPr>
+              <w:t>Reply Post by L林荫 (2026-06-30 10:13):</w:t>
+            </w:r>
+          </w:p>
+          <w:p>
+            <w:pPr>
+              <w:spacing w:line="276" w:lineRule="auto" w:after="100"/>
+            </w:pPr>
+            <w:r>
+              <w:rPr>
+                <w:sz w:val="20"/>
+              </w:rPr>
+              <w:t>科创半导体ETF华夏[588170] 这个是存盒吗？&amp;#160; 我看成分里面没有兆易之类的啊 ？</w:t>
+            </w:r>
+          </w:p>
+          <w:p>
+            <w:pPr>
+              <w:spacing w:line="276" w:lineRule="auto" w:after="100"/>
+            </w:pPr>
+            <w:r>
+              <w:rPr>
+                <w:sz w:val="20"/>
+              </w:rPr>
+              <w:t>能占1/4就不错了，还要考虑市值规模和成交额</w:t>
+            </w:r>
+          </w:p>
+          <w:p>
+            <w:pPr>
+              <w:spacing w:line="276" w:lineRule="auto" w:after="100"/>
+            </w:pPr>
+            <w:r>
+              <w:rPr>
+                <w:sz w:val="20"/>
+              </w:rPr>
+              <w:t>赵姨、兰起、百威、德明</w:t>
+            </w:r>
+          </w:p>
+          <w:p>
+            <w:pPr>
+              <w:spacing w:line="276" w:lineRule="auto" w:after="100"/>
+            </w:pPr>
+            <w:r>
+              <w:rPr>
+                <w:sz w:val="20"/>
+              </w:rPr>
+              <w:t>159801</w:t>
+            </w:r>
+            <w:r>
+              <w:br/>
+            </w:r>
+            <w:r>
+              <w:rPr>
+                <w:sz w:val="20"/>
+              </w:rPr>
+              <w:t>11.62+6.77+5.4+2.05=25.84%</w:t>
+            </w:r>
+            <w:r>
+              <w:br/>
+            </w:r>
+            <w:r>
+              <w:rPr>
+                <w:sz w:val="20"/>
+              </w:rPr>
+              <w:t>159546</w:t>
+            </w:r>
+            <w:r>
+              <w:br/>
+            </w:r>
+            <w:r>
+              <w:rPr>
+                <w:sz w:val="20"/>
+              </w:rPr>
+              <w:t>11.48+6.63+4.17+3.54=25.82%</w:t>
+            </w:r>
+            <w:r>
+              <w:br/>
+            </w:r>
+            <w:r>
+              <w:rPr>
+                <w:sz w:val="20"/>
+              </w:rPr>
+              <w:t>159995</w:t>
+            </w:r>
+            <w:r>
+              <w:br/>
+            </w:r>
+            <w:r>
+              <w:rPr>
+                <w:sz w:val="20"/>
+              </w:rPr>
+              <w:t>10.56+6.34+4.17+2.17=23.24%</w:t>
             </w:r>
           </w:p>
         </w:tc>

</xml_diff>